<commit_message>
combine all the processes and connect it with front
</commit_message>
<xml_diff>
--- a/backend/pfe-matcher/src/main/webapp/upload/PVs/AMATTOUCH Mohamed Ridouan/Fiche_Evaluation_PFE_ABAKOUY_Nabil.docx
+++ b/backend/pfe-matcher/src/main/webapp/upload/PVs/AMATTOUCH Mohamed Ridouan/Fiche_Evaluation_PFE_ABAKOUY_Nabil.docx
@@ -419,7 +419,7 @@
                 <w:sz w:val="24"/>
                 <w:b w:val="off"/>
               </w:rPr>
-              <w:t xml:space="preserve">Pr.       EL MORABIT Yasmina                Rapporteur                                                                     </w:t>
+              <w:t xml:space="preserve">Pr.       SAOU Abdelmonaim                Rapporteur                                                                     </w:t>
             </w:r>
           </w:p>
           <w:p>
@@ -442,7 +442,7 @@
                 <w:sz w:val="24"/>
                 <w:b w:val="off"/>
               </w:rPr>
-              <w:t xml:space="preserve">Pr.       OUALDCHAIB Sara                Rapporteur                                                                   </w:t>
+              <w:t xml:space="preserve">Pr.       ROUTAIB Hayat                Rapporteur                                                                   </w:t>
             </w:r>
           </w:p>
         </w:tc>
@@ -761,7 +761,7 @@
           <w:sz w:val="24"/>
           <w:b w:val="off"/>
         </w:rPr>
-        <w:t>Le : 	23/06/2025</w:t>
+        <w:t>Le : 	2026-05-20</w:t>
       </w:r>
     </w:p>
     <w:p>

</xml_diff>